<commit_message>
Zoomable circle packing : hierarchy layout
</commit_message>
<xml_diff>
--- a/rapport.docx
+++ b/rapport.docx
@@ -282,19 +282,76 @@
         <w:t>警力也不考虑都缺失</w:t>
       </w:r>
     </w:p>
+    <w:p>
+      <w:pPr>
+        <w:rPr>
+          <w:rFonts w:hint="eastAsia"/>
+        </w:rPr>
+      </w:pPr>
+    </w:p>
+    <w:p>
+      <w:pPr>
+        <w:rPr>
+          <w:rFonts w:hint="eastAsia"/>
+        </w:rPr>
+      </w:pPr>
+    </w:p>
+    <w:p>
+      <w:r>
+        <w:rPr>
+          <w:rFonts w:hint="eastAsia"/>
+        </w:rPr>
+        <w:t>双击取消选择灰色框</w:t>
+      </w:r>
+    </w:p>
     <w:p/>
     <w:p/>
     <w:p>
-      <w:pPr>
-        <w:rPr>
-          <w:rFonts w:hint="eastAsia"/>
-        </w:rPr>
-      </w:pPr>
-      <w:r>
-        <w:rPr>
-          <w:rFonts w:hint="eastAsia"/>
-        </w:rPr>
-        <w:t>双击取消选择灰色框</w:t>
+      <w:r>
+        <w:rPr>
+          <w:rFonts w:hint="eastAsia"/>
+        </w:rPr>
+        <w:t>树状图，圆圈图，方块图</w:t>
+      </w:r>
+    </w:p>
+    <w:p>
+      <w:r>
+        <w:rPr>
+          <w:rFonts w:hint="eastAsia"/>
+        </w:rPr>
+        <w:t>气泡图：</w:t>
+      </w:r>
+    </w:p>
+    <w:p>
+      <w:hyperlink r:id="rId4" w:history="1">
+        <w:r>
+          <w:rPr>
+            <w:rStyle w:val="ae"/>
+            <w:rFonts w:hint="eastAsia"/>
+          </w:rPr>
+          <w:t>https://observablehq.com/@d3/zoomable-circle-packing</w:t>
+        </w:r>
+      </w:hyperlink>
+    </w:p>
+    <w:p>
+      <w:r>
+        <w:rPr>
+          <w:rFonts w:hint="eastAsia"/>
+        </w:rPr>
+        <w:t>方形图：</w:t>
+      </w:r>
+    </w:p>
+    <w:p>
+      <w:pPr>
+        <w:rPr>
+          <w:rFonts w:hint="eastAsia"/>
+        </w:rPr>
+      </w:pPr>
+      <w:r>
+        <w:rPr>
+          <w:rFonts w:hint="eastAsia"/>
+        </w:rPr>
+        <w:t>https://observablehq.com/@d3/zoomable-treemap</w:t>
       </w:r>
     </w:p>
     <w:sectPr>
@@ -1231,6 +1288,29 @@
       <w:spacing w:val="5"/>
     </w:rPr>
   </w:style>
+  <w:style w:type="character" w:styleId="ae">
+    <w:name w:val="Hyperlink"/>
+    <w:basedOn w:val="a0"/>
+    <w:uiPriority w:val="99"/>
+    <w:unhideWhenUsed/>
+    <w:rsid w:val="006240FC"/>
+    <w:rPr>
+      <w:color w:val="467886" w:themeColor="hyperlink"/>
+      <w:u w:val="single"/>
+    </w:rPr>
+  </w:style>
+  <w:style w:type="character" w:styleId="af">
+    <w:name w:val="Unresolved Mention"/>
+    <w:basedOn w:val="a0"/>
+    <w:uiPriority w:val="99"/>
+    <w:semiHidden/>
+    <w:unhideWhenUsed/>
+    <w:rsid w:val="006240FC"/>
+    <w:rPr>
+      <w:color w:val="605E5C"/>
+      <w:shd w:val="clear" w:color="auto" w:fill="E1DFDD"/>
+    </w:rPr>
+  </w:style>
 </w:styles>
 </file>
 

</xml_diff>